<commit_message>
fix(tools): restore Device/Serial/Inventory/Additional info/Accessories layout in handover template
The simplified 3-column table lost the template's real structure (merged
Device column spanning a per-item Serial No./Inventory No./Additional
info/Accessories block) and dropped two fields engineers actually fill in.
Rebuilt the merge-field template to match the original layout exactly,
preserving its native vertical cell merge instead of reconstructing it
(editing merged cells through python-docx's high-level API silently
corrupts the merge chain — done via raw XML instead). Also fixes the
"Generate PDF" button/string, which was stale after the docx switch.
</commit_message>
<xml_diff>
--- a/backend/app/services/templates/handover_template.docx
+++ b/backend/app/services/templates/handover_template.docx
@@ -486,7 +486,7 @@
                 <w:szCs w:val="20"/>
                 <w:lang w:val="en-US"/>
               </w:rPr>
-              <w:t>Description</w:t>
+              <w:t>Device</w:t>
             </w:r>
           </w:p>
         </w:tc>
@@ -523,7 +523,7 @@
                 <w:szCs w:val="20"/>
                 <w:lang w:val="en-US"/>
               </w:rPr>
-              <w:t>Serial No. / Inventory No.</w:t>
+              <w:t>Description</w:t>
             </w:r>
           </w:p>
         </w:tc>
@@ -569,6 +569,118 @@
         <w:tc>
           <w:tcPr>
             <w:tcW w:w="1041" w:type="pct"/>
+            <w:tcBorders>
+              <w:top w:val="single" w:sz="4" w:space="0" w:color="auto"/>
+              <w:left w:val="single" w:sz="4" w:space="0" w:color="auto"/>
+              <w:bottom w:val="single" w:sz="4" w:space="0" w:color="auto"/>
+              <w:right w:val="single" w:sz="4" w:space="0" w:color="auto"/>
+            </w:tcBorders>
+            <w:hideMark/>
+          </w:tcPr>
+          <w:p>
+            <w:pPr>
+              <w:spacing w:line="240" w:lineRule="auto"/>
+              <w:rPr>
+                <w:rFonts w:asciiTheme="majorHAnsi" w:hAnsiTheme="majorHAnsi" w:cstheme="majorHAnsi"/>
+                <w:b/>
+                <w:bCs/>
+                <w:sz w:val="20"/>
+                <w:szCs w:val="20"/>
+                <w:lang w:val="en-US"/>
+              </w:rPr>
+            </w:pPr>
+            <w:r>
+              <w:rPr>
+                <w:rFonts w:asciiTheme="majorHAnsi" w:hAnsiTheme="majorHAnsi" w:cstheme="majorHAnsi"/>
+                <w:b/>
+                <w:bCs/>
+                <w:sz w:val="20"/>
+                <w:szCs w:val="20"/>
+                <w:lang w:val="en-US"/>
+              </w:rPr>
+              <w:t xml:space="preserve">{%tr for d in devices %}</w:t>
+            </w:r>
+          </w:p>
+        </w:tc>
+        <w:tc>
+          <w:tcPr>
+            <w:tcW w:w="3481" w:type="pct"/>
+            <w:gridSpan w:val="2"/>
+            <w:tcBorders>
+              <w:top w:val="single" w:sz="4" w:space="0" w:color="auto"/>
+              <w:left w:val="single" w:sz="4" w:space="0" w:color="auto"/>
+              <w:bottom w:val="single" w:sz="4" w:space="0" w:color="auto"/>
+              <w:right w:val="single" w:sz="4" w:space="0" w:color="auto"/>
+            </w:tcBorders>
+            <w:hideMark/>
+          </w:tcPr>
+          <w:p>
+            <w:pPr>
+              <w:spacing w:line="240" w:lineRule="auto"/>
+              <w:rPr>
+                <w:rFonts w:asciiTheme="majorHAnsi" w:hAnsiTheme="majorHAnsi" w:cstheme="majorHAnsi"/>
+                <w:b/>
+                <w:bCs/>
+                <w:sz w:val="20"/>
+                <w:szCs w:val="20"/>
+                <w:lang w:val="en-US"/>
+              </w:rPr>
+            </w:pPr>
+            <w:r>
+              <w:rPr>
+                <w:rFonts w:asciiTheme="majorHAnsi" w:hAnsiTheme="majorHAnsi" w:cstheme="majorHAnsi"/>
+                <w:b/>
+                <w:bCs/>
+                <w:sz w:val="20"/>
+                <w:szCs w:val="20"/>
+                <w:lang w:val="en-US"/>
+              </w:rPr>
+              <w:t xml:space="preserve"/>
+            </w:r>
+          </w:p>
+        </w:tc>
+        <w:tc>
+          <w:tcPr>
+            <w:tcW w:w="478" w:type="pct"/>
+            <w:tcBorders>
+              <w:top w:val="single" w:sz="4" w:space="0" w:color="auto"/>
+              <w:left w:val="single" w:sz="4" w:space="0" w:color="auto"/>
+              <w:bottom w:val="single" w:sz="4" w:space="0" w:color="auto"/>
+              <w:right w:val="single" w:sz="4" w:space="0" w:color="auto"/>
+            </w:tcBorders>
+            <w:hideMark/>
+          </w:tcPr>
+          <w:p>
+            <w:pPr>
+              <w:spacing w:line="240" w:lineRule="auto"/>
+              <w:jc w:val="center"/>
+              <w:rPr>
+                <w:rFonts w:asciiTheme="majorHAnsi" w:hAnsiTheme="majorHAnsi" w:cstheme="majorHAnsi"/>
+                <w:b/>
+                <w:bCs/>
+                <w:sz w:val="20"/>
+                <w:szCs w:val="20"/>
+                <w:lang w:val="en-US"/>
+              </w:rPr>
+            </w:pPr>
+            <w:r>
+              <w:rPr>
+                <w:rFonts w:asciiTheme="majorHAnsi" w:hAnsiTheme="majorHAnsi" w:cstheme="majorHAnsi"/>
+                <w:b/>
+                <w:bCs/>
+                <w:sz w:val="20"/>
+                <w:szCs w:val="20"/>
+                <w:lang w:val="en-US"/>
+              </w:rPr>
+              <w:t xml:space="preserve"/>
+            </w:r>
+          </w:p>
+        </w:tc>
+      </w:tr>
+      <w:tr>
+        <w:tc>
+          <w:tcPr>
+            <w:tcW w:w="1041" w:type="pct"/>
             <w:vMerge w:val="restart"/>
             <w:tcBorders>
               <w:top w:val="single" w:sz="4" w:space="0" w:color="auto"/>
@@ -588,7 +700,7 @@
               </w:rPr>
             </w:pPr>
             <w:r>
-              <w:t>{%tr for d in devices %}</w:t>
+              <w:t xml:space="preserve">{{ d.description }}</w:t>
             </w:r>
           </w:p>
         </w:tc>
@@ -620,6 +732,7 @@
                 <w:szCs w:val="20"/>
                 <w:lang w:val="en-US"/>
               </w:rPr>
+              <w:t>Serial No.:</w:t>
             </w:r>
           </w:p>
         </w:tc>
@@ -643,7 +756,9 @@
                 <w:lang w:val="en-US"/>
               </w:rPr>
             </w:pPr>
-            <w:r/>
+            <w:r>
+              <w:t>{{ d.serial_no }}</w:t>
+            </w:r>
           </w:p>
         </w:tc>
         <w:tc>
@@ -666,7 +781,9 @@
                 <w:lang w:val="en-US"/>
               </w:rPr>
             </w:pPr>
-            <w:r/>
+            <w:r>
+              <w:t>{{ d.quantity }}</w:t>
+            </w:r>
           </w:p>
         </w:tc>
       </w:tr>
@@ -674,27 +791,25 @@
         <w:tc>
           <w:tcPr>
             <w:tcW w:w="1041" w:type="pct"/>
-            <w:vMerge w:val="restart"/>
+            <w:vMerge/>
             <w:tcBorders>
               <w:top w:val="single" w:sz="4" w:space="0" w:color="auto"/>
               <w:left w:val="single" w:sz="4" w:space="0" w:color="auto"/>
               <w:bottom w:val="single" w:sz="4" w:space="0" w:color="auto"/>
               <w:right w:val="single" w:sz="4" w:space="0" w:color="auto"/>
             </w:tcBorders>
-          </w:tcPr>
-          <w:p>
-            <w:pPr>
-              <w:spacing w:line="240" w:lineRule="auto"/>
-              <w:rPr>
-                <w:rFonts w:asciiTheme="majorHAnsi" w:hAnsiTheme="majorHAnsi" w:cstheme="majorHAnsi"/>
-                <w:sz w:val="20"/>
-                <w:szCs w:val="20"/>
-                <w:lang w:val="en-US"/>
-              </w:rPr>
-            </w:pPr>
-            <w:r>
-              <w:t>{{ d.description }}</w:t>
-            </w:r>
+            <w:vAlign w:val="center"/>
+            <w:hideMark/>
+          </w:tcPr>
+          <w:p>
+            <w:pPr>
+              <w:rPr>
+                <w:rFonts w:asciiTheme="majorHAnsi" w:hAnsiTheme="majorHAnsi" w:cstheme="majorHAnsi"/>
+                <w:sz w:val="20"/>
+                <w:szCs w:val="20"/>
+                <w:lang w:val="en-US"/>
+              </w:rPr>
+            </w:pPr>
           </w:p>
         </w:tc>
         <w:tc>
@@ -725,7 +840,7 @@
                 <w:szCs w:val="20"/>
                 <w:lang w:val="en-US"/>
               </w:rPr>
-              <w:t>{{ d.serial_no }} / {{ d.inventory_no }}</w:t>
+              <w:t>Inventory No.:</w:t>
             </w:r>
           </w:p>
         </w:tc>
@@ -749,6 +864,9 @@
                 <w:lang w:val="en-US"/>
               </w:rPr>
             </w:pPr>
+            <w:r>
+              <w:t>{{ d.inventory_no }}</w:t>
+            </w:r>
           </w:p>
         </w:tc>
         <w:tc>
@@ -771,9 +889,7 @@
                 <w:lang w:val="en-US"/>
               </w:rPr>
             </w:pPr>
-            <w:r>
-              <w:t>{{ d.quantity }}</w:t>
-            </w:r>
+            <w:r/>
           </w:p>
         </w:tc>
       </w:tr>
@@ -781,27 +897,25 @@
         <w:tc>
           <w:tcPr>
             <w:tcW w:w="1041" w:type="pct"/>
-            <w:vMerge w:val="restart"/>
+            <w:vMerge/>
             <w:tcBorders>
               <w:top w:val="single" w:sz="4" w:space="0" w:color="auto"/>
               <w:left w:val="single" w:sz="4" w:space="0" w:color="auto"/>
               <w:bottom w:val="single" w:sz="4" w:space="0" w:color="auto"/>
               <w:right w:val="single" w:sz="4" w:space="0" w:color="auto"/>
             </w:tcBorders>
-          </w:tcPr>
-          <w:p>
-            <w:pPr>
-              <w:spacing w:line="240" w:lineRule="auto"/>
-              <w:rPr>
-                <w:rFonts w:asciiTheme="majorHAnsi" w:hAnsiTheme="majorHAnsi" w:cstheme="majorHAnsi"/>
-                <w:sz w:val="20"/>
-                <w:szCs w:val="20"/>
-                <w:lang w:val="en-US"/>
-              </w:rPr>
-            </w:pPr>
-            <w:r>
-              <w:t>{%tr endfor %}</w:t>
-            </w:r>
+            <w:vAlign w:val="center"/>
+            <w:hideMark/>
+          </w:tcPr>
+          <w:p>
+            <w:pPr>
+              <w:rPr>
+                <w:rFonts w:asciiTheme="majorHAnsi" w:hAnsiTheme="majorHAnsi" w:cstheme="majorHAnsi"/>
+                <w:sz w:val="20"/>
+                <w:szCs w:val="20"/>
+                <w:lang w:val="en-US"/>
+              </w:rPr>
+            </w:pPr>
           </w:p>
         </w:tc>
         <w:tc>
@@ -832,6 +946,7 @@
                 <w:szCs w:val="20"/>
                 <w:lang w:val="en-US"/>
               </w:rPr>
+              <w:t>Additional info:</w:t>
             </w:r>
           </w:p>
         </w:tc>
@@ -855,7 +970,9 @@
                 <w:lang w:val="en-US"/>
               </w:rPr>
             </w:pPr>
-            <w:r/>
+            <w:r>
+              <w:t>{{ d.additional_info }}</w:t>
+            </w:r>
           </w:p>
         </w:tc>
         <w:tc>
@@ -879,6 +996,319 @@
               </w:rPr>
             </w:pPr>
             <w:r/>
+          </w:p>
+        </w:tc>
+      </w:tr>
+      <w:tr>
+        <w:tc>
+          <w:tcPr>
+            <w:tcW w:w="1041" w:type="pct"/>
+            <w:vMerge/>
+            <w:tcBorders>
+              <w:top w:val="single" w:sz="4" w:space="0" w:color="auto"/>
+              <w:left w:val="single" w:sz="4" w:space="0" w:color="auto"/>
+              <w:bottom w:val="single" w:sz="4" w:space="0" w:color="auto"/>
+              <w:right w:val="single" w:sz="4" w:space="0" w:color="auto"/>
+            </w:tcBorders>
+            <w:vAlign w:val="center"/>
+            <w:hideMark/>
+          </w:tcPr>
+          <w:p>
+            <w:pPr>
+              <w:rPr>
+                <w:rFonts w:asciiTheme="majorHAnsi" w:hAnsiTheme="majorHAnsi" w:cstheme="majorHAnsi"/>
+                <w:sz w:val="20"/>
+                <w:szCs w:val="20"/>
+                <w:lang w:val="en-US"/>
+              </w:rPr>
+            </w:pPr>
+          </w:p>
+        </w:tc>
+        <w:tc>
+          <w:tcPr>
+            <w:tcW w:w="698" w:type="pct"/>
+            <w:tcBorders>
+              <w:top w:val="single" w:sz="4" w:space="0" w:color="auto"/>
+              <w:left w:val="single" w:sz="4" w:space="0" w:color="auto"/>
+              <w:bottom w:val="single" w:sz="4" w:space="0" w:color="auto"/>
+              <w:right w:val="single" w:sz="4" w:space="0" w:color="auto"/>
+            </w:tcBorders>
+          </w:tcPr>
+          <w:p>
+            <w:pPr>
+              <w:spacing w:line="240" w:lineRule="auto"/>
+              <w:rPr>
+                <w:rFonts w:asciiTheme="majorHAnsi" w:hAnsiTheme="majorHAnsi" w:cstheme="majorHAnsi"/>
+                <w:sz w:val="20"/>
+                <w:szCs w:val="20"/>
+                <w:lang w:val="en-US"/>
+              </w:rPr>
+            </w:pPr>
+            <w:r/>
+          </w:p>
+        </w:tc>
+        <w:tc>
+          <w:tcPr>
+            <w:tcW w:w="2783" w:type="pct"/>
+            <w:tcBorders>
+              <w:top w:val="single" w:sz="4" w:space="0" w:color="auto"/>
+              <w:left w:val="single" w:sz="4" w:space="0" w:color="auto"/>
+              <w:bottom w:val="single" w:sz="4" w:space="0" w:color="auto"/>
+              <w:right w:val="single" w:sz="4" w:space="0" w:color="auto"/>
+            </w:tcBorders>
+          </w:tcPr>
+          <w:p>
+            <w:pPr>
+              <w:spacing w:line="240" w:lineRule="auto"/>
+              <w:rPr>
+                <w:rFonts w:asciiTheme="majorHAnsi" w:hAnsiTheme="majorHAnsi" w:cstheme="majorHAnsi"/>
+                <w:sz w:val="20"/>
+                <w:szCs w:val="20"/>
+                <w:lang w:val="en-US"/>
+              </w:rPr>
+            </w:pPr>
+            <w:r/>
+          </w:p>
+        </w:tc>
+        <w:tc>
+          <w:tcPr>
+            <w:tcW w:w="478" w:type="pct"/>
+            <w:tcBorders>
+              <w:top w:val="single" w:sz="4" w:space="0" w:color="auto"/>
+              <w:left w:val="single" w:sz="4" w:space="0" w:color="auto"/>
+              <w:bottom w:val="single" w:sz="4" w:space="0" w:color="auto"/>
+              <w:right w:val="single" w:sz="4" w:space="0" w:color="auto"/>
+            </w:tcBorders>
+          </w:tcPr>
+          <w:p>
+            <w:pPr>
+              <w:spacing w:line="240" w:lineRule="auto"/>
+              <w:rPr>
+                <w:rFonts w:asciiTheme="majorHAnsi" w:hAnsiTheme="majorHAnsi" w:cstheme="majorHAnsi"/>
+                <w:sz w:val="20"/>
+                <w:szCs w:val="20"/>
+                <w:lang w:val="en-US"/>
+              </w:rPr>
+            </w:pPr>
+            <w:r/>
+          </w:p>
+        </w:tc>
+      </w:tr>
+      <w:tr>
+        <w:tc>
+          <w:tcPr>
+            <w:tcW w:w="1041" w:type="pct"/>
+            <w:vMerge/>
+            <w:tcBorders>
+              <w:top w:val="single" w:sz="4" w:space="0" w:color="auto"/>
+              <w:left w:val="single" w:sz="4" w:space="0" w:color="auto"/>
+              <w:bottom w:val="single" w:sz="4" w:space="0" w:color="auto"/>
+              <w:right w:val="single" w:sz="4" w:space="0" w:color="auto"/>
+            </w:tcBorders>
+            <w:vAlign w:val="center"/>
+            <w:hideMark/>
+          </w:tcPr>
+          <w:p>
+            <w:pPr>
+              <w:rPr>
+                <w:rFonts w:asciiTheme="majorHAnsi" w:hAnsiTheme="majorHAnsi" w:cstheme="majorHAnsi"/>
+                <w:sz w:val="20"/>
+                <w:szCs w:val="20"/>
+                <w:lang w:val="en-US"/>
+              </w:rPr>
+            </w:pPr>
+          </w:p>
+        </w:tc>
+        <w:tc>
+          <w:tcPr>
+            <w:tcW w:w="698" w:type="pct"/>
+            <w:tcBorders>
+              <w:top w:val="single" w:sz="4" w:space="0" w:color="auto"/>
+              <w:left w:val="single" w:sz="4" w:space="0" w:color="auto"/>
+              <w:bottom w:val="single" w:sz="4" w:space="0" w:color="auto"/>
+              <w:right w:val="single" w:sz="4" w:space="0" w:color="auto"/>
+            </w:tcBorders>
+            <w:hideMark/>
+          </w:tcPr>
+          <w:p>
+            <w:pPr>
+              <w:spacing w:line="240" w:lineRule="auto"/>
+              <w:rPr>
+                <w:rFonts w:asciiTheme="majorHAnsi" w:hAnsiTheme="majorHAnsi" w:cstheme="majorHAnsi"/>
+                <w:sz w:val="20"/>
+                <w:szCs w:val="20"/>
+                <w:lang w:val="en-US"/>
+              </w:rPr>
+            </w:pPr>
+            <w:r>
+              <w:rPr>
+                <w:rFonts w:asciiTheme="majorHAnsi" w:hAnsiTheme="majorHAnsi" w:cstheme="majorHAnsi"/>
+                <w:sz w:val="20"/>
+                <w:szCs w:val="20"/>
+                <w:lang w:val="en-US"/>
+              </w:rPr>
+              <w:t>Accessories:</w:t>
+            </w:r>
+          </w:p>
+        </w:tc>
+        <w:tc>
+          <w:tcPr>
+            <w:tcW w:w="2783" w:type="pct"/>
+            <w:tcBorders>
+              <w:top w:val="single" w:sz="4" w:space="0" w:color="auto"/>
+              <w:left w:val="single" w:sz="4" w:space="0" w:color="auto"/>
+              <w:bottom w:val="single" w:sz="4" w:space="0" w:color="auto"/>
+              <w:right w:val="single" w:sz="4" w:space="0" w:color="auto"/>
+            </w:tcBorders>
+          </w:tcPr>
+          <w:p>
+            <w:pPr>
+              <w:spacing w:line="240" w:lineRule="auto"/>
+              <w:rPr>
+                <w:rFonts w:asciiTheme="majorHAnsi" w:hAnsiTheme="majorHAnsi" w:cstheme="majorHAnsi"/>
+                <w:sz w:val="20"/>
+                <w:szCs w:val="20"/>
+                <w:lang w:val="en-US"/>
+              </w:rPr>
+            </w:pPr>
+            <w:r>
+              <w:t>{{ d.accessories }}</w:t>
+            </w:r>
+          </w:p>
+        </w:tc>
+        <w:tc>
+          <w:tcPr>
+            <w:tcW w:w="478" w:type="pct"/>
+            <w:tcBorders>
+              <w:top w:val="single" w:sz="4" w:space="0" w:color="auto"/>
+              <w:left w:val="single" w:sz="4" w:space="0" w:color="auto"/>
+              <w:bottom w:val="single" w:sz="4" w:space="0" w:color="auto"/>
+              <w:right w:val="single" w:sz="4" w:space="0" w:color="auto"/>
+            </w:tcBorders>
+          </w:tcPr>
+          <w:p>
+            <w:pPr>
+              <w:spacing w:line="240" w:lineRule="auto"/>
+              <w:rPr>
+                <w:rFonts w:asciiTheme="majorHAnsi" w:hAnsiTheme="majorHAnsi" w:cstheme="majorHAnsi"/>
+                <w:sz w:val="20"/>
+                <w:szCs w:val="20"/>
+                <w:lang w:val="en-US"/>
+              </w:rPr>
+            </w:pPr>
+            <w:r/>
+          </w:p>
+        </w:tc>
+      </w:tr>
+      <w:tr>
+        <w:tc>
+          <w:tcPr>
+            <w:tcW w:w="1041" w:type="pct"/>
+            <w:tcBorders>
+              <w:top w:val="single" w:sz="4" w:space="0" w:color="auto"/>
+              <w:left w:val="single" w:sz="4" w:space="0" w:color="auto"/>
+              <w:bottom w:val="single" w:sz="4" w:space="0" w:color="auto"/>
+              <w:right w:val="single" w:sz="4" w:space="0" w:color="auto"/>
+            </w:tcBorders>
+            <w:hideMark/>
+          </w:tcPr>
+          <w:p>
+            <w:pPr>
+              <w:spacing w:line="240" w:lineRule="auto"/>
+              <w:rPr>
+                <w:rFonts w:asciiTheme="majorHAnsi" w:hAnsiTheme="majorHAnsi" w:cstheme="majorHAnsi"/>
+                <w:b/>
+                <w:bCs/>
+                <w:sz w:val="20"/>
+                <w:szCs w:val="20"/>
+                <w:lang w:val="en-US"/>
+              </w:rPr>
+            </w:pPr>
+            <w:r>
+              <w:rPr>
+                <w:rFonts w:asciiTheme="majorHAnsi" w:hAnsiTheme="majorHAnsi" w:cstheme="majorHAnsi"/>
+                <w:b/>
+                <w:bCs/>
+                <w:sz w:val="20"/>
+                <w:szCs w:val="20"/>
+                <w:lang w:val="en-US"/>
+              </w:rPr>
+              <w:t xml:space="preserve">{%tr endfor %}</w:t>
+            </w:r>
+          </w:p>
+        </w:tc>
+        <w:tc>
+          <w:tcPr>
+            <w:tcW w:w="3481" w:type="pct"/>
+            <w:gridSpan w:val="2"/>
+            <w:tcBorders>
+              <w:top w:val="single" w:sz="4" w:space="0" w:color="auto"/>
+              <w:left w:val="single" w:sz="4" w:space="0" w:color="auto"/>
+              <w:bottom w:val="single" w:sz="4" w:space="0" w:color="auto"/>
+              <w:right w:val="single" w:sz="4" w:space="0" w:color="auto"/>
+            </w:tcBorders>
+            <w:hideMark/>
+          </w:tcPr>
+          <w:p>
+            <w:pPr>
+              <w:spacing w:line="240" w:lineRule="auto"/>
+              <w:rPr>
+                <w:rFonts w:asciiTheme="majorHAnsi" w:hAnsiTheme="majorHAnsi" w:cstheme="majorHAnsi"/>
+                <w:b/>
+                <w:bCs/>
+                <w:sz w:val="20"/>
+                <w:szCs w:val="20"/>
+                <w:lang w:val="en-US"/>
+              </w:rPr>
+            </w:pPr>
+            <w:r>
+              <w:rPr>
+                <w:rFonts w:asciiTheme="majorHAnsi" w:hAnsiTheme="majorHAnsi" w:cstheme="majorHAnsi"/>
+                <w:b/>
+                <w:bCs/>
+                <w:sz w:val="20"/>
+                <w:szCs w:val="20"/>
+                <w:lang w:val="en-US"/>
+              </w:rPr>
+              <w:t xml:space="preserve"/>
+            </w:r>
+          </w:p>
+        </w:tc>
+        <w:tc>
+          <w:tcPr>
+            <w:tcW w:w="478" w:type="pct"/>
+            <w:tcBorders>
+              <w:top w:val="single" w:sz="4" w:space="0" w:color="auto"/>
+              <w:left w:val="single" w:sz="4" w:space="0" w:color="auto"/>
+              <w:bottom w:val="single" w:sz="4" w:space="0" w:color="auto"/>
+              <w:right w:val="single" w:sz="4" w:space="0" w:color="auto"/>
+            </w:tcBorders>
+            <w:hideMark/>
+          </w:tcPr>
+          <w:p>
+            <w:pPr>
+              <w:spacing w:line="240" w:lineRule="auto"/>
+              <w:jc w:val="center"/>
+              <w:rPr>
+                <w:rFonts w:asciiTheme="majorHAnsi" w:hAnsiTheme="majorHAnsi" w:cstheme="majorHAnsi"/>
+                <w:b/>
+                <w:bCs/>
+                <w:sz w:val="20"/>
+                <w:szCs w:val="20"/>
+                <w:lang w:val="en-US"/>
+              </w:rPr>
+            </w:pPr>
+            <w:r>
+              <w:rPr>
+                <w:rFonts w:asciiTheme="majorHAnsi" w:hAnsiTheme="majorHAnsi" w:cstheme="majorHAnsi"/>
+                <w:b/>
+                <w:bCs/>
+                <w:sz w:val="20"/>
+                <w:szCs w:val="20"/>
+                <w:lang w:val="en-US"/>
+              </w:rPr>
+              <w:t xml:space="preserve"/>
+            </w:r>
           </w:p>
         </w:tc>
       </w:tr>

</xml_diff>

<commit_message>
refactor: move org-specific names into settings
- app/OTP/mail-from names, mail signature (team/website/telegram), customer
  bot link, handover company name and optional branded template path are now
  settings (env + Admin -> Settings); defaults are neutral
- /api/config exposes app_name and ticket_bot_url; UI reads them
- handover form template is neutral; a branded one can be supplied via
  HANDOVER_TEMPLATE_PATH
- drop .gitlab-ci.yml and the original handover example from the repo

Co-Authored-By: Claude Sonnet 5.5 <noreply@anthropic.com>
</commit_message>
<xml_diff>
--- a/backend/app/services/templates/handover_template.docx
+++ b/backend/app/services/templates/handover_template.docx
@@ -1466,7 +1466,7 @@
                 <w:szCs w:val="20"/>
                 <w:lang w:val="en-US"/>
               </w:rPr>
-              <w:t xml:space="preserve">I will use the Equipment only for purpose for which it is intended and for the purposes (i) of the assignment specified above (ii) or, if an employee, only for the purposes of my employment with (iii) or, if a freelancer, only for the purposes of my Freelance contract with Viory; </w:t>
+              <w:t xml:space="preserve">I will use the Equipment only for purpose for which it is intended and for the purposes (i) of the assignment specified above (ii) or, if an employee, only for the purposes of my employment with (iii) or, if a freelancer, only for the purposes of my Freelance contract with {{ company_name }}; </w:t>
             </w:r>
           </w:p>
           <w:p>
@@ -1709,7 +1709,7 @@
                 <w:szCs w:val="20"/>
                 <w:lang w:val="en-US"/>
               </w:rPr>
-              <w:t xml:space="preserve">I shall return the Equipment to Assignor forthwith (i) at the end of the assignment (ii) or, if an employee, upon termination of my employment with Viory (iii) or, if a freelancer, upon termination of my Freelance contract with Viory; </w:t>
+              <w:t xml:space="preserve">I shall return the Equipment to Assignor forthwith (i) at the end of the assignment (ii) or, if an employee, upon termination of my employment with {{ company_name }} (iii) or, if a freelancer, upon termination of my Freelance contract with {{ company_name }}; </w:t>
             </w:r>
           </w:p>
           <w:p>
@@ -1736,7 +1736,7 @@
                 <w:szCs w:val="20"/>
                 <w:lang w:val="en-US"/>
               </w:rPr>
-              <w:t>I shall repair or replace, at Assignor's discretion, any Equipment which is damaged or lost and I authorize Assignor to deduct the costs of such repair or replacement from any payments due to me from Viory or, if a freelancer, from my invoice amount.</w:t>
+              <w:t>I shall repair or replace, at Assignor's discretion, any Equipment which is damaged or lost and I authorize Assignor to deduct the costs of such repair or replacement from any payments due to me from {{ company_name }} or, if a freelancer, from my invoice amount.</w:t>
             </w:r>
           </w:p>
         </w:tc>
@@ -2485,7 +2485,7 @@
               <w:sz w:val="20"/>
               <w:szCs w:val="20"/>
             </w:rPr>
-            <w:t>www.viory.video</w:t>
+            <w:t>{{ assignor_name }}</w:t>
           </w:r>
         </w:p>
       </w:tc>
@@ -2775,7 +2775,7 @@
               <w:szCs w:val="20"/>
               <w:lang w:val="it-IT"/>
             </w:rPr>
-            <w:t xml:space="preserve">Darpo </w:t>
+            <w:t xml:space="preserve">{{ assignor_name }}</w:t>
           </w:r>
           <w:r>
             <w:rPr>
@@ -2785,7 +2785,7 @@
               <w:szCs w:val="20"/>
               <w:lang w:val="it-IT"/>
             </w:rPr>
-            <w:t xml:space="preserve">Vision </w:t>
+            <w:t xml:space="preserve"/>
           </w:r>
           <w:r>
             <w:rPr>
@@ -2795,7 +2795,7 @@
               <w:szCs w:val="20"/>
               <w:lang w:val="it-IT"/>
             </w:rPr>
-            <w:t xml:space="preserve">FZ LLC </w:t>
+            <w:t xml:space="preserve"/>
           </w:r>
           <w:r>
             <w:rPr>
@@ -2805,7 +2805,7 @@
               <w:szCs w:val="20"/>
               <w:lang w:val="en-US"/>
             </w:rPr>
-            <w:t>| DBA Viory</w:t>
+            <w:t/>
           </w:r>
           <w:r>
             <w:rPr>
@@ -2825,7 +2825,7 @@
               <w:szCs w:val="20"/>
               <w:lang w:val="en-US"/>
             </w:rPr>
-            <w:t>Registration</w:t>
+            <w:t/>
           </w:r>
           <w:r>
             <w:rPr>
@@ -2835,7 +2835,7 @@
               <w:szCs w:val="20"/>
               <w:lang w:val="en-US"/>
             </w:rPr>
-            <w:t xml:space="preserve"> No.</w:t>
+            <w:t xml:space="preserve"/>
           </w:r>
           <w:r>
             <w:rPr>
@@ -2845,7 +2845,7 @@
               <w:szCs w:val="20"/>
               <w:lang w:val="en-US"/>
             </w:rPr>
-            <w:t>:</w:t>
+            <w:t/>
           </w:r>
           <w:r>
             <w:rPr>
@@ -2855,7 +2855,7 @@
               <w:szCs w:val="20"/>
               <w:lang w:val="en-US"/>
             </w:rPr>
-            <w:t xml:space="preserve"> 1252</w:t>
+            <w:t xml:space="preserve"/>
           </w:r>
         </w:p>
         <w:p>
@@ -2881,7 +2881,7 @@
               <w:szCs w:val="20"/>
               <w:lang w:val="es-ES_tradnl"/>
             </w:rPr>
-            <w:t xml:space="preserve">PO Box: 769931, Abu </w:t>
+            <w:t xml:space="preserve"/>
           </w:r>
           <w:proofErr w:type="spellStart"/>
           <w:r>
@@ -2892,7 +2892,7 @@
               <w:szCs w:val="20"/>
               <w:lang w:val="es-ES_tradnl"/>
             </w:rPr>
-            <w:t>Dhabi</w:t>
+            <w:t/>
           </w:r>
           <w:proofErr w:type="spellEnd"/>
           <w:r>
@@ -2903,7 +2903,7 @@
               <w:szCs w:val="20"/>
               <w:lang w:val="es-ES_tradnl"/>
             </w:rPr>
-            <w:t>, UAE</w:t>
+            <w:t/>
           </w:r>
         </w:p>
         <w:p>
@@ -2925,7 +2925,7 @@
               <w:sz w:val="20"/>
               <w:szCs w:val="20"/>
             </w:rPr>
-            <w:t>www.viory.video</w:t>
+            <w:t/>
           </w:r>
         </w:p>
       </w:tc>
@@ -3186,13 +3186,13 @@
           <wp:extent cx="1759585" cy="719455"/>
           <wp:effectExtent l="0" t="0" r="0" b="4445"/>
           <wp:wrapNone/>
-          <wp:docPr id="1" name="officeArt object" descr="Viory_logo_mega_master_RGB_on_white.svg"/>
+          <wp:docPr id="1" name="officeArt object" descr="logo"/>
           <wp:cNvGraphicFramePr/>
           <a:graphic xmlns:a="http://schemas.openxmlformats.org/drawingml/2006/main">
             <a:graphicData uri="http://schemas.openxmlformats.org/drawingml/2006/picture">
               <pic:pic xmlns:pic="http://schemas.openxmlformats.org/drawingml/2006/picture">
                 <pic:nvPicPr>
-                  <pic:cNvPr id="1073741825" name="Viory_logo_mega_master_RGB_on_white.svg" descr="Viory_logo_mega_master_RGB_on_white.svg"/>
+                  <pic:cNvPr id="1073741825" name="logo" descr="logo"/>
                   <pic:cNvPicPr>
                     <a:picLocks noChangeAspect="1"/>
                   </pic:cNvPicPr>

</xml_diff>